<commit_message>
Lafond Parte 1: gancho mais direto, sem joias
Co-Authored-By: Claude Opus 5.5 <noreply@anthropic.com>
Claude-Session: https://claude.ai/code/session_01MJjUEEZrxQDEUifKK2vj9g
</commit_message>
<xml_diff>
--- a/roteiros/jorge-lafond/Lafond_Parte1.docx
+++ b/roteiros/jorge-lafond/Lafond_Parte1.docx
@@ -15,7 +15,7 @@
         <w:rPr>
           <w:color w:val="C00000"/>
         </w:rPr>
-        <w:t>Jorge Lafond foi enterrado em dois mil e três com joias que valiam mais de dez mil reais. Quinze anos depois, quando foram procurar o corpo dele no cemitério, ele simplesmente não estava mais lá.</w:t>
+        <w:t>Jorge Lafond foi enterrado diante de cinco mil pessoas. Quinze anos depois, quando foram procurar o corpo dele no cemitério, o túmulo estava vazio.</w:t>
       </w:r>
     </w:p>
     <w:p>
@@ -23,7 +23,7 @@
         <w:rPr>
           <w:color w:val="C00000"/>
         </w:rPr>
-        <w:t>O que pouca gente sabe é que, nos papéis do cemitério, alguém mexeu naquele túmulo. Mas até hoje ninguém sabe dizer para onde levaram o que estava lá dentro.</w:t>
+        <w:t>O que pouca gente sabe é que alguém tirou Jorge Lafond dali. E até hoje ninguém sabe dizer para onde o levaram.</w:t>
       </w:r>
     </w:p>
     <w:p>

</xml_diff>